<commit_message>
Update FSD Documentation Format.docx
</commit_message>
<xml_diff>
--- a/Project Documentation/FSD Documentation Format.docx
+++ b/Project Documentation/FSD Documentation Format.docx
@@ -2579,21 +2579,21 @@
           <w:sz w:val="27"/>
           <w:szCs w:val="27"/>
         </w:rPr>
-        <w:t xml:space="preserve">11. Screenshots or Demo </w:t>
-      </w:r>
-    </w:p>
-    <w:p>
-      <w:pPr>
-        <w:widowControl w:val="0"/>
-        <w:pBdr>
-          <w:top w:val="nil"/>
-          <w:left w:val="nil"/>
-          <w:bottom w:val="nil"/>
-          <w:right w:val="nil"/>
-          <w:between w:val="nil"/>
-        </w:pBdr>
-        <w:spacing w:before="276" w:line="461" w:lineRule="auto"/>
-        <w:ind w:left="13" w:right="1462" w:firstLine="352"/>
+        <w:t xml:space="preserve">11. Screenshots </w:t>
+      </w:r>
+    </w:p>
+    <w:p>
+      <w:pPr>
+        <w:widowControl w:val="0"/>
+        <w:pBdr>
+          <w:top w:val="nil"/>
+          <w:left w:val="nil"/>
+          <w:bottom w:val="nil"/>
+          <w:right w:val="nil"/>
+          <w:between w:val="nil"/>
+        </w:pBdr>
+        <w:spacing w:before="271" w:line="240" w:lineRule="auto"/>
+        <w:ind w:left="13"/>
         <w:rPr>
           <w:rFonts w:ascii="Times New Roman" w:eastAsia="Times New Roman" w:hAnsi="Times New Roman" w:cs="Times New Roman"/>
           <w:b/>
@@ -2605,22 +2605,794 @@
       </w:pPr>
       <w:r>
         <w:rPr>
-          <w:rFonts w:ascii="Noto Sans Symbols" w:eastAsia="Noto Sans Symbols" w:hAnsi="Noto Sans Symbols" w:cs="Noto Sans Symbols"/>
-          <w:color w:val="000000"/>
-          <w:sz w:val="19"/>
-          <w:szCs w:val="19"/>
-        </w:rPr>
-        <w:t xml:space="preserve">• </w:t>
-      </w:r>
-      <w:r>
-        <w:rPr>
-          <w:rFonts w:ascii="Times New Roman" w:eastAsia="Times New Roman" w:hAnsi="Times New Roman" w:cs="Times New Roman"/>
-          <w:color w:val="000000"/>
-          <w:sz w:val="24"/>
-          <w:szCs w:val="24"/>
-        </w:rPr>
-        <w:t xml:space="preserve">Provide screenshots or a link to a demo to showcase the application. </w:t>
-      </w:r>
+          <w:rFonts w:ascii="Times New Roman" w:eastAsia="Times New Roman" w:hAnsi="Times New Roman" w:cs="Times New Roman"/>
+          <w:b/>
+          <w:bCs/>
+          <w:color w:val="000000"/>
+          <w:sz w:val="27"/>
+          <w:szCs w:val="27"/>
+        </w:rPr>
+        <w:drawing>
+          <wp:inline distT="0" distB="0" distL="0" distR="0" wp14:anchorId="2741CDFB" wp14:editId="584A5D40">
+            <wp:extent cx="5538470" cy="3115310"/>
+            <wp:effectExtent l="0" t="0" r="5080" b="8890"/>
+            <wp:docPr id="128727485" name="Picture 2"/>
+            <wp:cNvGraphicFramePr>
+              <a:graphicFrameLocks xmlns:a="http://schemas.openxmlformats.org/drawingml/2006/main" noChangeAspect="1"/>
+            </wp:cNvGraphicFramePr>
+            <a:graphic xmlns:a="http://schemas.openxmlformats.org/drawingml/2006/main">
+              <a:graphicData uri="http://schemas.openxmlformats.org/drawingml/2006/picture">
+                <pic:pic xmlns:pic="http://schemas.openxmlformats.org/drawingml/2006/picture">
+                  <pic:nvPicPr>
+                    <pic:cNvPr id="0" name="Picture 6"/>
+                    <pic:cNvPicPr>
+                      <a:picLocks noChangeAspect="1" noChangeArrowheads="1"/>
+                    </pic:cNvPicPr>
+                  </pic:nvPicPr>
+                  <pic:blipFill>
+                    <a:blip r:embed="rId5" cstate="print">
+                      <a:extLst>
+                        <a:ext uri="{28A0092B-C50C-407E-A947-70E740481C1C}">
+                          <a14:useLocalDpi xmlns:a14="http://schemas.microsoft.com/office/drawing/2010/main" val="0"/>
+                        </a:ext>
+                      </a:extLst>
+                    </a:blip>
+                    <a:srcRect/>
+                    <a:stretch>
+                      <a:fillRect/>
+                    </a:stretch>
+                  </pic:blipFill>
+                  <pic:spPr bwMode="auto">
+                    <a:xfrm>
+                      <a:off x="0" y="0"/>
+                      <a:ext cx="5538470" cy="3115310"/>
+                    </a:xfrm>
+                    <a:prstGeom prst="rect">
+                      <a:avLst/>
+                    </a:prstGeom>
+                    <a:noFill/>
+                    <a:ln>
+                      <a:noFill/>
+                    </a:ln>
+                  </pic:spPr>
+                </pic:pic>
+              </a:graphicData>
+            </a:graphic>
+          </wp:inline>
+        </w:drawing>
+      </w:r>
+    </w:p>
+    <w:p>
+      <w:pPr>
+        <w:widowControl w:val="0"/>
+        <w:pBdr>
+          <w:top w:val="nil"/>
+          <w:left w:val="nil"/>
+          <w:bottom w:val="nil"/>
+          <w:right w:val="nil"/>
+          <w:between w:val="nil"/>
+        </w:pBdr>
+        <w:spacing w:before="271" w:line="240" w:lineRule="auto"/>
+        <w:ind w:left="13"/>
+        <w:rPr>
+          <w:rFonts w:ascii="Times New Roman" w:eastAsia="Times New Roman" w:hAnsi="Times New Roman" w:cs="Times New Roman"/>
+          <w:b/>
+          <w:bCs/>
+          <w:color w:val="000000"/>
+          <w:sz w:val="27"/>
+          <w:szCs w:val="27"/>
+        </w:rPr>
+      </w:pPr>
+      <w:r>
+        <w:rPr>
+          <w:rFonts w:ascii="Times New Roman" w:eastAsia="Times New Roman" w:hAnsi="Times New Roman" w:cs="Times New Roman"/>
+          <w:b/>
+          <w:bCs/>
+          <w:color w:val="000000"/>
+          <w:sz w:val="27"/>
+          <w:szCs w:val="27"/>
+        </w:rPr>
+        <w:lastRenderedPageBreak/>
+        <w:drawing>
+          <wp:inline distT="0" distB="0" distL="0" distR="0" wp14:anchorId="24AD427F" wp14:editId="4FE6FC97">
+            <wp:extent cx="5538470" cy="3115310"/>
+            <wp:effectExtent l="0" t="0" r="5080" b="8890"/>
+            <wp:docPr id="634252995" name="Picture 4"/>
+            <wp:cNvGraphicFramePr>
+              <a:graphicFrameLocks xmlns:a="http://schemas.openxmlformats.org/drawingml/2006/main" noChangeAspect="1"/>
+            </wp:cNvGraphicFramePr>
+            <a:graphic xmlns:a="http://schemas.openxmlformats.org/drawingml/2006/main">
+              <a:graphicData uri="http://schemas.openxmlformats.org/drawingml/2006/picture">
+                <pic:pic xmlns:pic="http://schemas.openxmlformats.org/drawingml/2006/picture">
+                  <pic:nvPicPr>
+                    <pic:cNvPr id="0" name="Picture 13"/>
+                    <pic:cNvPicPr>
+                      <a:picLocks noChangeAspect="1" noChangeArrowheads="1"/>
+                    </pic:cNvPicPr>
+                  </pic:nvPicPr>
+                  <pic:blipFill>
+                    <a:blip r:embed="rId6" cstate="print">
+                      <a:extLst>
+                        <a:ext uri="{28A0092B-C50C-407E-A947-70E740481C1C}">
+                          <a14:useLocalDpi xmlns:a14="http://schemas.microsoft.com/office/drawing/2010/main" val="0"/>
+                        </a:ext>
+                      </a:extLst>
+                    </a:blip>
+                    <a:srcRect/>
+                    <a:stretch>
+                      <a:fillRect/>
+                    </a:stretch>
+                  </pic:blipFill>
+                  <pic:spPr bwMode="auto">
+                    <a:xfrm>
+                      <a:off x="0" y="0"/>
+                      <a:ext cx="5538470" cy="3115310"/>
+                    </a:xfrm>
+                    <a:prstGeom prst="rect">
+                      <a:avLst/>
+                    </a:prstGeom>
+                    <a:noFill/>
+                    <a:ln>
+                      <a:noFill/>
+                    </a:ln>
+                  </pic:spPr>
+                </pic:pic>
+              </a:graphicData>
+            </a:graphic>
+          </wp:inline>
+        </w:drawing>
+      </w:r>
+    </w:p>
+    <w:p>
+      <w:pPr>
+        <w:widowControl w:val="0"/>
+        <w:pBdr>
+          <w:top w:val="nil"/>
+          <w:left w:val="nil"/>
+          <w:bottom w:val="nil"/>
+          <w:right w:val="nil"/>
+          <w:between w:val="nil"/>
+        </w:pBdr>
+        <w:spacing w:before="271" w:line="240" w:lineRule="auto"/>
+        <w:ind w:left="13"/>
+        <w:rPr>
+          <w:rFonts w:ascii="Times New Roman" w:eastAsia="Times New Roman" w:hAnsi="Times New Roman" w:cs="Times New Roman"/>
+          <w:b/>
+          <w:bCs/>
+          <w:color w:val="000000"/>
+          <w:sz w:val="27"/>
+          <w:szCs w:val="27"/>
+        </w:rPr>
+      </w:pPr>
+      <w:r>
+        <w:rPr>
+          <w:rFonts w:ascii="Times New Roman" w:eastAsia="Times New Roman" w:hAnsi="Times New Roman" w:cs="Times New Roman"/>
+          <w:b/>
+          <w:bCs/>
+          <w:color w:val="000000"/>
+          <w:sz w:val="27"/>
+          <w:szCs w:val="27"/>
+        </w:rPr>
+        <w:drawing>
+          <wp:inline distT="0" distB="0" distL="0" distR="0" wp14:anchorId="486D05C3" wp14:editId="254B2C16">
+            <wp:extent cx="5538470" cy="3115310"/>
+            <wp:effectExtent l="0" t="0" r="5080" b="8890"/>
+            <wp:docPr id="1973528965" name="Picture 6"/>
+            <wp:cNvGraphicFramePr>
+              <a:graphicFrameLocks xmlns:a="http://schemas.openxmlformats.org/drawingml/2006/main" noChangeAspect="1"/>
+            </wp:cNvGraphicFramePr>
+            <a:graphic xmlns:a="http://schemas.openxmlformats.org/drawingml/2006/main">
+              <a:graphicData uri="http://schemas.openxmlformats.org/drawingml/2006/picture">
+                <pic:pic xmlns:pic="http://schemas.openxmlformats.org/drawingml/2006/picture">
+                  <pic:nvPicPr>
+                    <pic:cNvPr id="0" name="Picture 20"/>
+                    <pic:cNvPicPr>
+                      <a:picLocks noChangeAspect="1" noChangeArrowheads="1"/>
+                    </pic:cNvPicPr>
+                  </pic:nvPicPr>
+                  <pic:blipFill>
+                    <a:blip r:embed="rId7" cstate="print">
+                      <a:extLst>
+                        <a:ext uri="{28A0092B-C50C-407E-A947-70E740481C1C}">
+                          <a14:useLocalDpi xmlns:a14="http://schemas.microsoft.com/office/drawing/2010/main" val="0"/>
+                        </a:ext>
+                      </a:extLst>
+                    </a:blip>
+                    <a:srcRect/>
+                    <a:stretch>
+                      <a:fillRect/>
+                    </a:stretch>
+                  </pic:blipFill>
+                  <pic:spPr bwMode="auto">
+                    <a:xfrm>
+                      <a:off x="0" y="0"/>
+                      <a:ext cx="5538470" cy="3115310"/>
+                    </a:xfrm>
+                    <a:prstGeom prst="rect">
+                      <a:avLst/>
+                    </a:prstGeom>
+                    <a:noFill/>
+                    <a:ln>
+                      <a:noFill/>
+                    </a:ln>
+                  </pic:spPr>
+                </pic:pic>
+              </a:graphicData>
+            </a:graphic>
+          </wp:inline>
+        </w:drawing>
+      </w:r>
+    </w:p>
+    <w:p>
+      <w:pPr>
+        <w:widowControl w:val="0"/>
+        <w:pBdr>
+          <w:top w:val="nil"/>
+          <w:left w:val="nil"/>
+          <w:bottom w:val="nil"/>
+          <w:right w:val="nil"/>
+          <w:between w:val="nil"/>
+        </w:pBdr>
+        <w:spacing w:before="271" w:line="240" w:lineRule="auto"/>
+        <w:ind w:left="13"/>
+        <w:rPr>
+          <w:rFonts w:ascii="Times New Roman" w:eastAsia="Times New Roman" w:hAnsi="Times New Roman" w:cs="Times New Roman"/>
+          <w:b/>
+          <w:bCs/>
+          <w:color w:val="000000"/>
+          <w:sz w:val="27"/>
+          <w:szCs w:val="27"/>
+        </w:rPr>
+      </w:pPr>
+      <w:r>
+        <w:rPr>
+          <w:rFonts w:ascii="Times New Roman" w:eastAsia="Times New Roman" w:hAnsi="Times New Roman" w:cs="Times New Roman"/>
+          <w:b/>
+          <w:bCs/>
+          <w:color w:val="000000"/>
+          <w:sz w:val="27"/>
+          <w:szCs w:val="27"/>
+        </w:rPr>
+        <w:lastRenderedPageBreak/>
+        <w:drawing>
+          <wp:inline distT="0" distB="0" distL="0" distR="0" wp14:anchorId="3B523126" wp14:editId="0572EF18">
+            <wp:extent cx="5538470" cy="3115310"/>
+            <wp:effectExtent l="0" t="0" r="5080" b="8890"/>
+            <wp:docPr id="1013699389" name="Picture 8"/>
+            <wp:cNvGraphicFramePr>
+              <a:graphicFrameLocks xmlns:a="http://schemas.openxmlformats.org/drawingml/2006/main" noChangeAspect="1"/>
+            </wp:cNvGraphicFramePr>
+            <a:graphic xmlns:a="http://schemas.openxmlformats.org/drawingml/2006/main">
+              <a:graphicData uri="http://schemas.openxmlformats.org/drawingml/2006/picture">
+                <pic:pic xmlns:pic="http://schemas.openxmlformats.org/drawingml/2006/picture">
+                  <pic:nvPicPr>
+                    <pic:cNvPr id="0" name="Picture 27"/>
+                    <pic:cNvPicPr>
+                      <a:picLocks noChangeAspect="1" noChangeArrowheads="1"/>
+                    </pic:cNvPicPr>
+                  </pic:nvPicPr>
+                  <pic:blipFill>
+                    <a:blip r:embed="rId8" cstate="print">
+                      <a:extLst>
+                        <a:ext uri="{28A0092B-C50C-407E-A947-70E740481C1C}">
+                          <a14:useLocalDpi xmlns:a14="http://schemas.microsoft.com/office/drawing/2010/main" val="0"/>
+                        </a:ext>
+                      </a:extLst>
+                    </a:blip>
+                    <a:srcRect/>
+                    <a:stretch>
+                      <a:fillRect/>
+                    </a:stretch>
+                  </pic:blipFill>
+                  <pic:spPr bwMode="auto">
+                    <a:xfrm>
+                      <a:off x="0" y="0"/>
+                      <a:ext cx="5538470" cy="3115310"/>
+                    </a:xfrm>
+                    <a:prstGeom prst="rect">
+                      <a:avLst/>
+                    </a:prstGeom>
+                    <a:noFill/>
+                    <a:ln>
+                      <a:noFill/>
+                    </a:ln>
+                  </pic:spPr>
+                </pic:pic>
+              </a:graphicData>
+            </a:graphic>
+          </wp:inline>
+        </w:drawing>
+      </w:r>
+    </w:p>
+    <w:p>
+      <w:pPr>
+        <w:widowControl w:val="0"/>
+        <w:pBdr>
+          <w:top w:val="nil"/>
+          <w:left w:val="nil"/>
+          <w:bottom w:val="nil"/>
+          <w:right w:val="nil"/>
+          <w:between w:val="nil"/>
+        </w:pBdr>
+        <w:spacing w:before="271" w:line="240" w:lineRule="auto"/>
+        <w:ind w:left="13"/>
+        <w:rPr>
+          <w:rFonts w:ascii="Times New Roman" w:eastAsia="Times New Roman" w:hAnsi="Times New Roman" w:cs="Times New Roman"/>
+          <w:b/>
+          <w:bCs/>
+          <w:color w:val="000000"/>
+          <w:sz w:val="27"/>
+          <w:szCs w:val="27"/>
+        </w:rPr>
+      </w:pPr>
+      <w:r>
+        <w:rPr>
+          <w:rFonts w:ascii="Times New Roman" w:eastAsia="Times New Roman" w:hAnsi="Times New Roman" w:cs="Times New Roman"/>
+          <w:b/>
+          <w:bCs/>
+          <w:color w:val="000000"/>
+          <w:sz w:val="27"/>
+          <w:szCs w:val="27"/>
+        </w:rPr>
+        <w:drawing>
+          <wp:inline distT="0" distB="0" distL="0" distR="0" wp14:anchorId="2EE32B95" wp14:editId="7A540C90">
+            <wp:extent cx="5538470" cy="3115310"/>
+            <wp:effectExtent l="0" t="0" r="5080" b="8890"/>
+            <wp:docPr id="716691622" name="Picture 10"/>
+            <wp:cNvGraphicFramePr>
+              <a:graphicFrameLocks xmlns:a="http://schemas.openxmlformats.org/drawingml/2006/main" noChangeAspect="1"/>
+            </wp:cNvGraphicFramePr>
+            <a:graphic xmlns:a="http://schemas.openxmlformats.org/drawingml/2006/main">
+              <a:graphicData uri="http://schemas.openxmlformats.org/drawingml/2006/picture">
+                <pic:pic xmlns:pic="http://schemas.openxmlformats.org/drawingml/2006/picture">
+                  <pic:nvPicPr>
+                    <pic:cNvPr id="0" name="Picture 34"/>
+                    <pic:cNvPicPr>
+                      <a:picLocks noChangeAspect="1" noChangeArrowheads="1"/>
+                    </pic:cNvPicPr>
+                  </pic:nvPicPr>
+                  <pic:blipFill>
+                    <a:blip r:embed="rId9" cstate="print">
+                      <a:extLst>
+                        <a:ext uri="{28A0092B-C50C-407E-A947-70E740481C1C}">
+                          <a14:useLocalDpi xmlns:a14="http://schemas.microsoft.com/office/drawing/2010/main" val="0"/>
+                        </a:ext>
+                      </a:extLst>
+                    </a:blip>
+                    <a:srcRect/>
+                    <a:stretch>
+                      <a:fillRect/>
+                    </a:stretch>
+                  </pic:blipFill>
+                  <pic:spPr bwMode="auto">
+                    <a:xfrm>
+                      <a:off x="0" y="0"/>
+                      <a:ext cx="5538470" cy="3115310"/>
+                    </a:xfrm>
+                    <a:prstGeom prst="rect">
+                      <a:avLst/>
+                    </a:prstGeom>
+                    <a:noFill/>
+                    <a:ln>
+                      <a:noFill/>
+                    </a:ln>
+                  </pic:spPr>
+                </pic:pic>
+              </a:graphicData>
+            </a:graphic>
+          </wp:inline>
+        </w:drawing>
+      </w:r>
+    </w:p>
+    <w:p>
+      <w:pPr>
+        <w:widowControl w:val="0"/>
+        <w:pBdr>
+          <w:top w:val="nil"/>
+          <w:left w:val="nil"/>
+          <w:bottom w:val="nil"/>
+          <w:right w:val="nil"/>
+          <w:between w:val="nil"/>
+        </w:pBdr>
+        <w:spacing w:before="271" w:line="240" w:lineRule="auto"/>
+        <w:ind w:left="13"/>
+        <w:rPr>
+          <w:rFonts w:ascii="Times New Roman" w:eastAsia="Times New Roman" w:hAnsi="Times New Roman" w:cs="Times New Roman"/>
+          <w:b/>
+          <w:bCs/>
+          <w:color w:val="000000"/>
+          <w:sz w:val="27"/>
+          <w:szCs w:val="27"/>
+        </w:rPr>
+      </w:pPr>
+      <w:r>
+        <w:rPr>
+          <w:rFonts w:ascii="Times New Roman" w:eastAsia="Times New Roman" w:hAnsi="Times New Roman" w:cs="Times New Roman"/>
+          <w:b/>
+          <w:bCs/>
+          <w:color w:val="000000"/>
+          <w:sz w:val="27"/>
+          <w:szCs w:val="27"/>
+        </w:rPr>
+        <w:lastRenderedPageBreak/>
+        <w:drawing>
+          <wp:inline distT="0" distB="0" distL="0" distR="0" wp14:anchorId="2D6EA07B" wp14:editId="2E74C7D4">
+            <wp:extent cx="5538470" cy="3115310"/>
+            <wp:effectExtent l="0" t="0" r="5080" b="8890"/>
+            <wp:docPr id="1774601714" name="Picture 14"/>
+            <wp:cNvGraphicFramePr>
+              <a:graphicFrameLocks xmlns:a="http://schemas.openxmlformats.org/drawingml/2006/main" noChangeAspect="1"/>
+            </wp:cNvGraphicFramePr>
+            <a:graphic xmlns:a="http://schemas.openxmlformats.org/drawingml/2006/main">
+              <a:graphicData uri="http://schemas.openxmlformats.org/drawingml/2006/picture">
+                <pic:pic xmlns:pic="http://schemas.openxmlformats.org/drawingml/2006/picture">
+                  <pic:nvPicPr>
+                    <pic:cNvPr id="0" name="Picture 48"/>
+                    <pic:cNvPicPr>
+                      <a:picLocks noChangeAspect="1" noChangeArrowheads="1"/>
+                    </pic:cNvPicPr>
+                  </pic:nvPicPr>
+                  <pic:blipFill>
+                    <a:blip r:embed="rId10" cstate="print">
+                      <a:extLst>
+                        <a:ext uri="{28A0092B-C50C-407E-A947-70E740481C1C}">
+                          <a14:useLocalDpi xmlns:a14="http://schemas.microsoft.com/office/drawing/2010/main" val="0"/>
+                        </a:ext>
+                      </a:extLst>
+                    </a:blip>
+                    <a:srcRect/>
+                    <a:stretch>
+                      <a:fillRect/>
+                    </a:stretch>
+                  </pic:blipFill>
+                  <pic:spPr bwMode="auto">
+                    <a:xfrm>
+                      <a:off x="0" y="0"/>
+                      <a:ext cx="5538470" cy="3115310"/>
+                    </a:xfrm>
+                    <a:prstGeom prst="rect">
+                      <a:avLst/>
+                    </a:prstGeom>
+                    <a:noFill/>
+                    <a:ln>
+                      <a:noFill/>
+                    </a:ln>
+                  </pic:spPr>
+                </pic:pic>
+              </a:graphicData>
+            </a:graphic>
+          </wp:inline>
+        </w:drawing>
+      </w:r>
+    </w:p>
+    <w:p>
+      <w:pPr>
+        <w:widowControl w:val="0"/>
+        <w:pBdr>
+          <w:top w:val="nil"/>
+          <w:left w:val="nil"/>
+          <w:bottom w:val="nil"/>
+          <w:right w:val="nil"/>
+          <w:between w:val="nil"/>
+        </w:pBdr>
+        <w:spacing w:before="271" w:line="240" w:lineRule="auto"/>
+        <w:ind w:left="13"/>
+        <w:rPr>
+          <w:rFonts w:ascii="Times New Roman" w:eastAsia="Times New Roman" w:hAnsi="Times New Roman" w:cs="Times New Roman"/>
+          <w:b/>
+          <w:bCs/>
+          <w:color w:val="000000"/>
+          <w:sz w:val="27"/>
+          <w:szCs w:val="27"/>
+        </w:rPr>
+      </w:pPr>
+      <w:r>
+        <w:rPr>
+          <w:rFonts w:ascii="Times New Roman" w:eastAsia="Times New Roman" w:hAnsi="Times New Roman" w:cs="Times New Roman"/>
+          <w:b/>
+          <w:bCs/>
+          <w:color w:val="000000"/>
+          <w:sz w:val="27"/>
+          <w:szCs w:val="27"/>
+        </w:rPr>
+        <w:drawing>
+          <wp:inline distT="0" distB="0" distL="0" distR="0" wp14:anchorId="45D488B8" wp14:editId="2A4B8688">
+            <wp:extent cx="5538470" cy="3115310"/>
+            <wp:effectExtent l="0" t="0" r="5080" b="8890"/>
+            <wp:docPr id="1546160819" name="Picture 16"/>
+            <wp:cNvGraphicFramePr>
+              <a:graphicFrameLocks xmlns:a="http://schemas.openxmlformats.org/drawingml/2006/main" noChangeAspect="1"/>
+            </wp:cNvGraphicFramePr>
+            <a:graphic xmlns:a="http://schemas.openxmlformats.org/drawingml/2006/main">
+              <a:graphicData uri="http://schemas.openxmlformats.org/drawingml/2006/picture">
+                <pic:pic xmlns:pic="http://schemas.openxmlformats.org/drawingml/2006/picture">
+                  <pic:nvPicPr>
+                    <pic:cNvPr id="0" name="Picture 55"/>
+                    <pic:cNvPicPr>
+                      <a:picLocks noChangeAspect="1" noChangeArrowheads="1"/>
+                    </pic:cNvPicPr>
+                  </pic:nvPicPr>
+                  <pic:blipFill>
+                    <a:blip r:embed="rId11" cstate="print">
+                      <a:extLst>
+                        <a:ext uri="{28A0092B-C50C-407E-A947-70E740481C1C}">
+                          <a14:useLocalDpi xmlns:a14="http://schemas.microsoft.com/office/drawing/2010/main" val="0"/>
+                        </a:ext>
+                      </a:extLst>
+                    </a:blip>
+                    <a:srcRect/>
+                    <a:stretch>
+                      <a:fillRect/>
+                    </a:stretch>
+                  </pic:blipFill>
+                  <pic:spPr bwMode="auto">
+                    <a:xfrm>
+                      <a:off x="0" y="0"/>
+                      <a:ext cx="5538470" cy="3115310"/>
+                    </a:xfrm>
+                    <a:prstGeom prst="rect">
+                      <a:avLst/>
+                    </a:prstGeom>
+                    <a:noFill/>
+                    <a:ln>
+                      <a:noFill/>
+                    </a:ln>
+                  </pic:spPr>
+                </pic:pic>
+              </a:graphicData>
+            </a:graphic>
+          </wp:inline>
+        </w:drawing>
+      </w:r>
+    </w:p>
+    <w:p>
+      <w:pPr>
+        <w:widowControl w:val="0"/>
+        <w:pBdr>
+          <w:top w:val="nil"/>
+          <w:left w:val="nil"/>
+          <w:bottom w:val="nil"/>
+          <w:right w:val="nil"/>
+          <w:between w:val="nil"/>
+        </w:pBdr>
+        <w:spacing w:before="271" w:line="240" w:lineRule="auto"/>
+        <w:ind w:left="13"/>
+        <w:rPr>
+          <w:rFonts w:ascii="Times New Roman" w:eastAsia="Times New Roman" w:hAnsi="Times New Roman" w:cs="Times New Roman"/>
+          <w:b/>
+          <w:bCs/>
+          <w:color w:val="000000"/>
+          <w:sz w:val="27"/>
+          <w:szCs w:val="27"/>
+        </w:rPr>
+      </w:pPr>
+      <w:r>
+        <w:rPr>
+          <w:rFonts w:ascii="Times New Roman" w:eastAsia="Times New Roman" w:hAnsi="Times New Roman" w:cs="Times New Roman"/>
+          <w:b/>
+          <w:bCs/>
+          <w:color w:val="000000"/>
+          <w:sz w:val="27"/>
+          <w:szCs w:val="27"/>
+        </w:rPr>
+        <w:lastRenderedPageBreak/>
+        <w:drawing>
+          <wp:inline distT="0" distB="0" distL="0" distR="0" wp14:anchorId="4B25349E" wp14:editId="6F40F6DE">
+            <wp:extent cx="5538470" cy="3115310"/>
+            <wp:effectExtent l="0" t="0" r="5080" b="8890"/>
+            <wp:docPr id="836707827" name="Picture 18"/>
+            <wp:cNvGraphicFramePr>
+              <a:graphicFrameLocks xmlns:a="http://schemas.openxmlformats.org/drawingml/2006/main" noChangeAspect="1"/>
+            </wp:cNvGraphicFramePr>
+            <a:graphic xmlns:a="http://schemas.openxmlformats.org/drawingml/2006/main">
+              <a:graphicData uri="http://schemas.openxmlformats.org/drawingml/2006/picture">
+                <pic:pic xmlns:pic="http://schemas.openxmlformats.org/drawingml/2006/picture">
+                  <pic:nvPicPr>
+                    <pic:cNvPr id="0" name="Picture 62"/>
+                    <pic:cNvPicPr>
+                      <a:picLocks noChangeAspect="1" noChangeArrowheads="1"/>
+                    </pic:cNvPicPr>
+                  </pic:nvPicPr>
+                  <pic:blipFill>
+                    <a:blip r:embed="rId12" cstate="print">
+                      <a:extLst>
+                        <a:ext uri="{28A0092B-C50C-407E-A947-70E740481C1C}">
+                          <a14:useLocalDpi xmlns:a14="http://schemas.microsoft.com/office/drawing/2010/main" val="0"/>
+                        </a:ext>
+                      </a:extLst>
+                    </a:blip>
+                    <a:srcRect/>
+                    <a:stretch>
+                      <a:fillRect/>
+                    </a:stretch>
+                  </pic:blipFill>
+                  <pic:spPr bwMode="auto">
+                    <a:xfrm>
+                      <a:off x="0" y="0"/>
+                      <a:ext cx="5538470" cy="3115310"/>
+                    </a:xfrm>
+                    <a:prstGeom prst="rect">
+                      <a:avLst/>
+                    </a:prstGeom>
+                    <a:noFill/>
+                    <a:ln>
+                      <a:noFill/>
+                    </a:ln>
+                  </pic:spPr>
+                </pic:pic>
+              </a:graphicData>
+            </a:graphic>
+          </wp:inline>
+        </w:drawing>
+      </w:r>
+    </w:p>
+    <w:p>
+      <w:pPr>
+        <w:widowControl w:val="0"/>
+        <w:pBdr>
+          <w:top w:val="nil"/>
+          <w:left w:val="nil"/>
+          <w:bottom w:val="nil"/>
+          <w:right w:val="nil"/>
+          <w:between w:val="nil"/>
+        </w:pBdr>
+        <w:spacing w:before="271" w:line="240" w:lineRule="auto"/>
+        <w:ind w:left="13"/>
+        <w:rPr>
+          <w:rFonts w:ascii="Times New Roman" w:eastAsia="Times New Roman" w:hAnsi="Times New Roman" w:cs="Times New Roman"/>
+          <w:b/>
+          <w:bCs/>
+          <w:color w:val="000000"/>
+          <w:sz w:val="27"/>
+          <w:szCs w:val="27"/>
+        </w:rPr>
+      </w:pPr>
+    </w:p>
+    <w:p>
+      <w:pPr>
+        <w:widowControl w:val="0"/>
+        <w:pBdr>
+          <w:top w:val="nil"/>
+          <w:left w:val="nil"/>
+          <w:bottom w:val="nil"/>
+          <w:right w:val="nil"/>
+          <w:between w:val="nil"/>
+        </w:pBdr>
+        <w:spacing w:before="271" w:line="240" w:lineRule="auto"/>
+        <w:ind w:left="13"/>
+        <w:rPr>
+          <w:rFonts w:ascii="Times New Roman" w:eastAsia="Times New Roman" w:hAnsi="Times New Roman" w:cs="Times New Roman"/>
+          <w:b/>
+          <w:bCs/>
+          <w:color w:val="000000"/>
+          <w:sz w:val="27"/>
+          <w:szCs w:val="27"/>
+        </w:rPr>
+      </w:pPr>
+      <w:r>
+        <w:rPr>
+          <w:rFonts w:ascii="Times New Roman" w:eastAsia="Times New Roman" w:hAnsi="Times New Roman" w:cs="Times New Roman"/>
+          <w:b/>
+          <w:bCs/>
+          <w:color w:val="000000"/>
+          <w:sz w:val="27"/>
+          <w:szCs w:val="27"/>
+        </w:rPr>
+        <w:drawing>
+          <wp:inline distT="0" distB="0" distL="0" distR="0" wp14:anchorId="2A8B24B7" wp14:editId="6626D206">
+            <wp:extent cx="5538470" cy="3115310"/>
+            <wp:effectExtent l="0" t="0" r="5080" b="8890"/>
+            <wp:docPr id="1005027964" name="Picture 12"/>
+            <wp:cNvGraphicFramePr>
+              <a:graphicFrameLocks xmlns:a="http://schemas.openxmlformats.org/drawingml/2006/main" noChangeAspect="1"/>
+            </wp:cNvGraphicFramePr>
+            <a:graphic xmlns:a="http://schemas.openxmlformats.org/drawingml/2006/main">
+              <a:graphicData uri="http://schemas.openxmlformats.org/drawingml/2006/picture">
+                <pic:pic xmlns:pic="http://schemas.openxmlformats.org/drawingml/2006/picture">
+                  <pic:nvPicPr>
+                    <pic:cNvPr id="0" name="Picture 41"/>
+                    <pic:cNvPicPr>
+                      <a:picLocks noChangeAspect="1" noChangeArrowheads="1"/>
+                    </pic:cNvPicPr>
+                  </pic:nvPicPr>
+                  <pic:blipFill>
+                    <a:blip r:embed="rId13" cstate="print">
+                      <a:extLst>
+                        <a:ext uri="{28A0092B-C50C-407E-A947-70E740481C1C}">
+                          <a14:useLocalDpi xmlns:a14="http://schemas.microsoft.com/office/drawing/2010/main" val="0"/>
+                        </a:ext>
+                      </a:extLst>
+                    </a:blip>
+                    <a:srcRect/>
+                    <a:stretch>
+                      <a:fillRect/>
+                    </a:stretch>
+                  </pic:blipFill>
+                  <pic:spPr bwMode="auto">
+                    <a:xfrm>
+                      <a:off x="0" y="0"/>
+                      <a:ext cx="5538470" cy="3115310"/>
+                    </a:xfrm>
+                    <a:prstGeom prst="rect">
+                      <a:avLst/>
+                    </a:prstGeom>
+                    <a:noFill/>
+                    <a:ln>
+                      <a:noFill/>
+                    </a:ln>
+                  </pic:spPr>
+                </pic:pic>
+              </a:graphicData>
+            </a:graphic>
+          </wp:inline>
+        </w:drawing>
+      </w:r>
+    </w:p>
+    <w:p>
+      <w:pPr>
+        <w:widowControl w:val="0"/>
+        <w:pBdr>
+          <w:top w:val="nil"/>
+          <w:left w:val="nil"/>
+          <w:bottom w:val="nil"/>
+          <w:right w:val="nil"/>
+          <w:between w:val="nil"/>
+        </w:pBdr>
+        <w:spacing w:before="271" w:line="240" w:lineRule="auto"/>
+        <w:ind w:left="13"/>
+        <w:rPr>
+          <w:rFonts w:ascii="Times New Roman" w:eastAsia="Times New Roman" w:hAnsi="Times New Roman" w:cs="Times New Roman"/>
+          <w:b/>
+          <w:bCs/>
+          <w:color w:val="000000"/>
+          <w:sz w:val="27"/>
+          <w:szCs w:val="27"/>
+        </w:rPr>
+      </w:pPr>
+    </w:p>
+    <w:p>
+      <w:pPr>
+        <w:widowControl w:val="0"/>
+        <w:pBdr>
+          <w:top w:val="nil"/>
+          <w:left w:val="nil"/>
+          <w:bottom w:val="nil"/>
+          <w:right w:val="nil"/>
+          <w:between w:val="nil"/>
+        </w:pBdr>
+        <w:spacing w:before="271" w:line="240" w:lineRule="auto"/>
+        <w:ind w:left="13"/>
+        <w:rPr>
+          <w:rFonts w:ascii="Times New Roman" w:eastAsia="Times New Roman" w:hAnsi="Times New Roman" w:cs="Times New Roman"/>
+          <w:b/>
+          <w:bCs/>
+          <w:color w:val="000000"/>
+          <w:sz w:val="27"/>
+          <w:szCs w:val="27"/>
+        </w:rPr>
+      </w:pPr>
+    </w:p>
+    <w:p>
+      <w:pPr>
+        <w:widowControl w:val="0"/>
+        <w:pBdr>
+          <w:top w:val="nil"/>
+          <w:left w:val="nil"/>
+          <w:bottom w:val="nil"/>
+          <w:right w:val="nil"/>
+          <w:between w:val="nil"/>
+        </w:pBdr>
+        <w:spacing w:before="276" w:line="461" w:lineRule="auto"/>
+        <w:ind w:right="1462"/>
+        <w:rPr>
+          <w:rFonts w:ascii="Times New Roman" w:eastAsia="Times New Roman" w:hAnsi="Times New Roman" w:cs="Times New Roman"/>
+          <w:b/>
+          <w:bCs/>
+          <w:color w:val="000000"/>
+          <w:sz w:val="27"/>
+          <w:szCs w:val="27"/>
+        </w:rPr>
+      </w:pPr>
       <w:r>
         <w:rPr>
           <w:rFonts w:ascii="Times New Roman" w:eastAsia="Times New Roman" w:hAnsi="Times New Roman" w:cs="Times New Roman"/>
@@ -2698,6 +3470,7 @@
           <w:sz w:val="19"/>
           <w:szCs w:val="19"/>
         </w:rPr>
+        <w:lastRenderedPageBreak/>
         <w:t>Fraud detection model requires larger training dataset.</w:t>
       </w:r>
     </w:p>
@@ -2712,14 +3485,12 @@
           <w:between w:val="nil"/>
         </w:pBdr>
         <w:spacing w:before="59" w:line="462" w:lineRule="auto"/>
-        <w:ind w:left="13" w:right="210" w:firstLine="352"/>
-        <w:rPr>
-          <w:rFonts w:ascii="Times New Roman" w:eastAsia="Times New Roman" w:hAnsi="Times New Roman" w:cs="Times New Roman"/>
-          <w:b/>
-          <w:bCs/>
-          <w:color w:val="000000"/>
-          <w:sz w:val="27"/>
-          <w:szCs w:val="27"/>
+        <w:ind w:right="210"/>
+        <w:rPr>
+          <w:rFonts w:ascii="Noto Sans Symbols" w:eastAsia="Noto Sans Symbols" w:hAnsi="Noto Sans Symbols" w:cs="Noto Sans Symbols"/>
+          <w:color w:val="000000"/>
+          <w:sz w:val="19"/>
+          <w:szCs w:val="19"/>
         </w:rPr>
       </w:pPr>
       <w:r>

</xml_diff>